<commit_message>
Revert "Updated templates and edited attachment block logic"
</commit_message>
<xml_diff>
--- a/docassemble/SmallClClaimAndAffidavit/data/templates/claim_affidavit_Addendum.docx
+++ b/docassemble/SmallClClaimAndAffidavit/data/templates/claim_affidavit_Addendum.docx
@@ -1,6 +1,6 @@
 
 <file path=word/document.xml><?xml version="1.0" encoding="utf-8"?>
-<w:document xmlns:wpc="http://schemas.microsoft.com/office/word/2010/wordprocessingCanvas" xmlns:cx="http://schemas.microsoft.com/office/drawing/2014/chartex" xmlns:cx1="http://schemas.microsoft.com/office/drawing/2015/9/8/chartex" xmlns:cx2="http://schemas.microsoft.com/office/drawing/2015/10/21/chartex" xmlns:cx3="http://schemas.microsoft.com/office/drawing/2016/5/9/chartex" xmlns:cx4="http://schemas.microsoft.com/office/drawing/2016/5/10/chartex" xmlns:cx5="http://schemas.microsoft.com/office/drawing/2016/5/11/chartex" xmlns:cx6="http://schemas.microsoft.com/office/drawing/2016/5/12/chartex" xmlns:cx7="http://schemas.microsoft.com/office/drawing/2016/5/13/chartex" xmlns:cx8="http://schemas.microsoft.com/office/drawing/2016/5/14/chartex" xmlns:mc="http://schemas.openxmlformats.org/markup-compatibility/2006" xmlns:m="http://schemas.openxmlformats.org/officeDocument/2006/math" xmlns:aink="http://schemas.microsoft.com/office/drawing/2016/ink" xmlns:am3d="http://schemas.microsoft.com/office/drawing/2017/model3d" xmlns:oel="http://schemas.microsoft.com/office/2019/extlst" xmlns:r="http://schemas.openxmlformats.org/officeDocument/2006/relationships" xmlns:wp14="http://schemas.microsoft.com/office/word/2010/wordprocessingDrawing" xmlns:wp="http://schemas.openxmlformats.org/drawingml/2006/wordprocessingDrawing" xmlns:wpg="http://schemas.microsoft.com/office/word/2010/wordprocessingGroup" xmlns:wpi="http://schemas.microsoft.com/office/word/2010/wordprocessingInk" xmlns:wps="http://schemas.microsoft.com/office/word/2010/wordprocessingShape" xmlns:o="urn:schemas-microsoft-com:office:office" xmlns:v="urn:schemas-microsoft-com:vml" xmlns:w10="urn:schemas-microsoft-com:office:word" xmlns:w="http://schemas.openxmlformats.org/wordprocessingml/2006/main" xmlns:w14="http://schemas.microsoft.com/office/word/2010/wordml" xmlns:w15="http://schemas.microsoft.com/office/word/2012/wordml" xmlns:w16cex="http://schemas.microsoft.com/office/word/2018/wordml/cex" xmlns:w16cid="http://schemas.microsoft.com/office/word/2016/wordml/cid" xmlns:w16="http://schemas.microsoft.com/office/word/2018/wordml" xmlns:w16sdtdh="http://schemas.microsoft.com/office/word/2020/wordml/sdtdatahash" xmlns:w16sdtfl="http://schemas.microsoft.com/office/word/2024/wordml/sdtformatlock" xmlns:w16se="http://schemas.microsoft.com/office/word/2015/wordml/symex" xmlns:w16du="http://schemas.microsoft.com/office/word/2023/wordml/word16du" xmlns:wne="http://schemas.microsoft.com/office/word/2006/wordml" mc:Ignorable="w14 w15 w16se w16cid w16 w16cex w16sdtdh w16sdtfl w16du wp14">
+<w:document xmlns:wpc="http://schemas.microsoft.com/office/word/2010/wordprocessingCanvas" xmlns:cx="http://schemas.microsoft.com/office/drawing/2014/chartex" xmlns:cx1="http://schemas.microsoft.com/office/drawing/2015/9/8/chartex" xmlns:cx2="http://schemas.microsoft.com/office/drawing/2015/10/21/chartex" xmlns:cx3="http://schemas.microsoft.com/office/drawing/2016/5/9/chartex" xmlns:cx4="http://schemas.microsoft.com/office/drawing/2016/5/10/chartex" xmlns:cx5="http://schemas.microsoft.com/office/drawing/2016/5/11/chartex" xmlns:cx6="http://schemas.microsoft.com/office/drawing/2016/5/12/chartex" xmlns:cx7="http://schemas.microsoft.com/office/drawing/2016/5/13/chartex" xmlns:cx8="http://schemas.microsoft.com/office/drawing/2016/5/14/chartex" xmlns:mc="http://schemas.openxmlformats.org/markup-compatibility/2006" xmlns:aink="http://schemas.microsoft.com/office/drawing/2016/ink" xmlns:am3d="http://schemas.microsoft.com/office/drawing/2017/model3d" xmlns:o="urn:schemas-microsoft-com:office:office" xmlns:oel="http://schemas.microsoft.com/office/2019/extlst" xmlns:r="http://schemas.openxmlformats.org/officeDocument/2006/relationships" xmlns:m="http://schemas.openxmlformats.org/officeDocument/2006/math" xmlns:v="urn:schemas-microsoft-com:vml" xmlns:wp14="http://schemas.microsoft.com/office/word/2010/wordprocessingDrawing" xmlns:wp="http://schemas.openxmlformats.org/drawingml/2006/wordprocessingDrawing" xmlns:w10="urn:schemas-microsoft-com:office:word" xmlns:w="http://schemas.openxmlformats.org/wordprocessingml/2006/main" xmlns:w14="http://schemas.microsoft.com/office/word/2010/wordml" xmlns:w15="http://schemas.microsoft.com/office/word/2012/wordml" xmlns:w16cex="http://schemas.microsoft.com/office/word/2018/wordml/cex" xmlns:w16cid="http://schemas.microsoft.com/office/word/2016/wordml/cid" xmlns:w16="http://schemas.microsoft.com/office/word/2018/wordml" xmlns:w16du="http://schemas.microsoft.com/office/word/2023/wordml/word16du" xmlns:w16sdtdh="http://schemas.microsoft.com/office/word/2020/wordml/sdtdatahash" xmlns:w16sdtfl="http://schemas.microsoft.com/office/word/2024/wordml/sdtformatlock" xmlns:w16se="http://schemas.microsoft.com/office/word/2015/wordml/symex" xmlns:wpg="http://schemas.microsoft.com/office/word/2010/wordprocessingGroup" xmlns:wpi="http://schemas.microsoft.com/office/word/2010/wordprocessingInk" xmlns:wne="http://schemas.microsoft.com/office/word/2006/wordml" xmlns:wps="http://schemas.microsoft.com/office/word/2010/wordprocessingShape" mc:Ignorable="w14 w15 w16se w16cid w16 w16cex w16sdtdh w16sdtfl w16du wp14">
   <w:body>
     <w:tbl>
       <w:tblPr>
@@ -59,6 +59,7 @@
                 <w:szCs w:val="20"/>
               </w:rPr>
             </w:pPr>
+            <w:proofErr w:type="gramStart"/>
             <w:r>
               <w:rPr>
                 <w:b/>
@@ -67,7 +68,40 @@
                 <w:sz w:val="24"/>
                 <w:szCs w:val="24"/>
               </w:rPr>
-              <w:t>{{ the_court.number }}</w:t>
+              <w:t>{{ the</w:t>
+            </w:r>
+            <w:proofErr w:type="gramEnd"/>
+            <w:r>
+              <w:rPr>
+                <w:b/>
+                <w:bCs/>
+                <w:caps/>
+                <w:sz w:val="24"/>
+                <w:szCs w:val="24"/>
+              </w:rPr>
+              <w:t>_</w:t>
+            </w:r>
+            <w:proofErr w:type="gramStart"/>
+            <w:r>
+              <w:rPr>
+                <w:b/>
+                <w:bCs/>
+                <w:caps/>
+                <w:sz w:val="24"/>
+                <w:szCs w:val="24"/>
+              </w:rPr>
+              <w:t>court.number }</w:t>
+            </w:r>
+            <w:proofErr w:type="gramEnd"/>
+            <w:r>
+              <w:rPr>
+                <w:b/>
+                <w:bCs/>
+                <w:caps/>
+                <w:sz w:val="24"/>
+                <w:szCs w:val="24"/>
+              </w:rPr>
+              <w:t>}</w:t>
             </w:r>
             <w:r>
               <w:rPr>
@@ -142,25 +176,7 @@
                 <w:sz w:val="24"/>
                 <w:szCs w:val="24"/>
               </w:rPr>
-              <w:t>SMALL</w:t>
-            </w:r>
-            <w:r>
-              <w:rPr>
-                <w:b/>
-                <w:bCs/>
-                <w:sz w:val="24"/>
-                <w:szCs w:val="24"/>
-              </w:rPr>
-              <w:t xml:space="preserve"> CLAIM</w:t>
-            </w:r>
-            <w:r>
-              <w:rPr>
-                <w:b/>
-                <w:bCs/>
-                <w:sz w:val="24"/>
-                <w:szCs w:val="24"/>
-              </w:rPr>
-              <w:t xml:space="preserve">S </w:t>
+              <w:t>AFFIDAVIT AND CLAIM</w:t>
             </w:r>
           </w:p>
           <w:p>
@@ -180,7 +196,7 @@
                 <w:sz w:val="24"/>
                 <w:szCs w:val="24"/>
               </w:rPr>
-              <w:t>AFFIDAVIT</w:t>
+              <w:t>Small Claims</w:t>
             </w:r>
           </w:p>
         </w:tc>
@@ -261,9 +277,19 @@
           <w:sz w:val="24"/>
           <w:szCs w:val="24"/>
         </w:rPr>
-        <w:t>claim_affidavit.overflow</w:t>
+        <w:t>claim_</w:t>
+      </w:r>
+      <w:proofErr w:type="gramStart"/>
+      <w:r>
+        <w:rPr>
+          <w:rFonts w:ascii="Arial" w:hAnsi="Arial" w:cs="Arial"/>
+          <w:sz w:val="24"/>
+          <w:szCs w:val="24"/>
+        </w:rPr>
+        <w:t>affidavit.overflow</w:t>
       </w:r>
       <w:proofErr w:type="spellEnd"/>
+      <w:proofErr w:type="gramEnd"/>
       <w:r>
         <w:rPr>
           <w:rFonts w:ascii="Arial" w:hAnsi="Arial" w:cs="Arial"/>
@@ -290,7 +316,43 @@
           <w:sz w:val="24"/>
           <w:szCs w:val="24"/>
         </w:rPr>
-        <w:t xml:space="preserve">{%p if field.is_object_list() %} </w:t>
+        <w:t xml:space="preserve">{%p if </w:t>
+      </w:r>
+      <w:proofErr w:type="spellStart"/>
+      <w:r>
+        <w:rPr>
+          <w:rFonts w:ascii="Arial" w:hAnsi="Arial" w:cs="Arial"/>
+          <w:sz w:val="24"/>
+          <w:szCs w:val="24"/>
+        </w:rPr>
+        <w:t>field.is_object_</w:t>
+      </w:r>
+      <w:proofErr w:type="gramStart"/>
+      <w:r>
+        <w:rPr>
+          <w:rFonts w:ascii="Arial" w:hAnsi="Arial" w:cs="Arial"/>
+          <w:sz w:val="24"/>
+          <w:szCs w:val="24"/>
+        </w:rPr>
+        <w:t>list</w:t>
+      </w:r>
+      <w:proofErr w:type="spellEnd"/>
+      <w:r>
+        <w:rPr>
+          <w:rFonts w:ascii="Arial" w:hAnsi="Arial" w:cs="Arial"/>
+          <w:sz w:val="24"/>
+          <w:szCs w:val="24"/>
+        </w:rPr>
+        <w:t>(</w:t>
+      </w:r>
+      <w:proofErr w:type="gramEnd"/>
+      <w:r>
+        <w:rPr>
+          <w:rFonts w:ascii="Arial" w:hAnsi="Arial" w:cs="Arial"/>
+          <w:sz w:val="24"/>
+          <w:szCs w:val="24"/>
+        </w:rPr>
+        <w:t xml:space="preserve">) %} </w:t>
       </w:r>
       <w:r>
         <w:rPr>
@@ -309,12 +371,53 @@
           <w:szCs w:val="24"/>
         </w:rPr>
       </w:pPr>
-      <w:r>
-        <w:rPr>
-          <w:sz w:val="24"/>
-          <w:szCs w:val="24"/>
-        </w:rPr>
-        <w:t xml:space="preserve">{{ field.label }}: </w:t>
+      <w:proofErr w:type="gramStart"/>
+      <w:r>
+        <w:rPr>
+          <w:sz w:val="24"/>
+          <w:szCs w:val="24"/>
+        </w:rPr>
+        <w:t xml:space="preserve">{{ </w:t>
+      </w:r>
+      <w:proofErr w:type="spellStart"/>
+      <w:r>
+        <w:rPr>
+          <w:sz w:val="24"/>
+          <w:szCs w:val="24"/>
+        </w:rPr>
+        <w:t>field</w:t>
+      </w:r>
+      <w:proofErr w:type="gramEnd"/>
+      <w:r>
+        <w:rPr>
+          <w:sz w:val="24"/>
+          <w:szCs w:val="24"/>
+        </w:rPr>
+        <w:t>.</w:t>
+      </w:r>
+      <w:proofErr w:type="gramStart"/>
+      <w:r>
+        <w:rPr>
+          <w:sz w:val="24"/>
+          <w:szCs w:val="24"/>
+        </w:rPr>
+        <w:t>label</w:t>
+      </w:r>
+      <w:proofErr w:type="spellEnd"/>
+      <w:r>
+        <w:rPr>
+          <w:sz w:val="24"/>
+          <w:szCs w:val="24"/>
+        </w:rPr>
+        <w:t xml:space="preserve"> }</w:t>
+      </w:r>
+      <w:proofErr w:type="gramEnd"/>
+      <w:r>
+        <w:rPr>
+          <w:sz w:val="24"/>
+          <w:szCs w:val="24"/>
+        </w:rPr>
+        <w:t xml:space="preserve">}: </w:t>
       </w:r>
     </w:p>
     <w:p>
@@ -325,29 +428,67 @@
           <w:szCs w:val="24"/>
         </w:rPr>
       </w:pPr>
-      <w:r>
-        <w:rPr>
-          <w:rFonts w:ascii="Arial" w:hAnsi="Arial" w:cs="Arial"/>
-          <w:sz w:val="24"/>
-          <w:szCs w:val="24"/>
-        </w:rPr>
-        <w:t>{{ field</w:t>
-      </w:r>
-      <w:r>
-        <w:rPr>
-          <w:rFonts w:ascii="Arial" w:hAnsi="Arial" w:cs="Arial"/>
-          <w:sz w:val="24"/>
-          <w:szCs w:val="24"/>
-        </w:rPr>
-        <w:t>.value_if_defined()</w:t>
-      </w:r>
-      <w:r>
-        <w:rPr>
-          <w:rFonts w:ascii="Arial" w:hAnsi="Arial" w:cs="Arial"/>
-          <w:sz w:val="24"/>
-          <w:szCs w:val="24"/>
-        </w:rPr>
-        <w:t xml:space="preserve"> }}</w:t>
+      <w:proofErr w:type="gramStart"/>
+      <w:r>
+        <w:rPr>
+          <w:rFonts w:ascii="Arial" w:hAnsi="Arial" w:cs="Arial"/>
+          <w:sz w:val="24"/>
+          <w:szCs w:val="24"/>
+        </w:rPr>
+        <w:t xml:space="preserve">{{ </w:t>
+      </w:r>
+      <w:proofErr w:type="spellStart"/>
+      <w:r>
+        <w:rPr>
+          <w:rFonts w:ascii="Arial" w:hAnsi="Arial" w:cs="Arial"/>
+          <w:sz w:val="24"/>
+          <w:szCs w:val="24"/>
+        </w:rPr>
+        <w:t>field</w:t>
+      </w:r>
+      <w:proofErr w:type="gramEnd"/>
+      <w:r>
+        <w:rPr>
+          <w:rFonts w:ascii="Arial" w:hAnsi="Arial" w:cs="Arial"/>
+          <w:sz w:val="24"/>
+          <w:szCs w:val="24"/>
+        </w:rPr>
+        <w:t>.value_if_</w:t>
+      </w:r>
+      <w:proofErr w:type="gramStart"/>
+      <w:r>
+        <w:rPr>
+          <w:rFonts w:ascii="Arial" w:hAnsi="Arial" w:cs="Arial"/>
+          <w:sz w:val="24"/>
+          <w:szCs w:val="24"/>
+        </w:rPr>
+        <w:t>defined</w:t>
+      </w:r>
+      <w:proofErr w:type="spellEnd"/>
+      <w:r>
+        <w:rPr>
+          <w:rFonts w:ascii="Arial" w:hAnsi="Arial" w:cs="Arial"/>
+          <w:sz w:val="24"/>
+          <w:szCs w:val="24"/>
+        </w:rPr>
+        <w:t>()</w:t>
+      </w:r>
+      <w:r>
+        <w:rPr>
+          <w:rFonts w:ascii="Arial" w:hAnsi="Arial" w:cs="Arial"/>
+          <w:sz w:val="24"/>
+          <w:szCs w:val="24"/>
+        </w:rPr>
+        <w:t xml:space="preserve"> }</w:t>
+      </w:r>
+      <w:proofErr w:type="gramEnd"/>
+      <w:r>
+        <w:rPr>
+          <w:rFonts w:ascii="Arial" w:hAnsi="Arial" w:cs="Arial"/>
+          <w:sz w:val="24"/>
+          <w:szCs w:val="24"/>
+        </w:rPr>
+        <w:t>}</w:t>
       </w:r>
     </w:p>
     <w:p>
@@ -375,12 +516,53 @@
           <w:szCs w:val="24"/>
         </w:rPr>
       </w:pPr>
-      <w:r>
-        <w:rPr>
-          <w:sz w:val="24"/>
-          <w:szCs w:val="24"/>
-        </w:rPr>
-        <w:t xml:space="preserve">{{ field.label }}: </w:t>
+      <w:proofErr w:type="gramStart"/>
+      <w:r>
+        <w:rPr>
+          <w:sz w:val="24"/>
+          <w:szCs w:val="24"/>
+        </w:rPr>
+        <w:t xml:space="preserve">{{ </w:t>
+      </w:r>
+      <w:proofErr w:type="spellStart"/>
+      <w:r>
+        <w:rPr>
+          <w:sz w:val="24"/>
+          <w:szCs w:val="24"/>
+        </w:rPr>
+        <w:t>field</w:t>
+      </w:r>
+      <w:proofErr w:type="gramEnd"/>
+      <w:r>
+        <w:rPr>
+          <w:sz w:val="24"/>
+          <w:szCs w:val="24"/>
+        </w:rPr>
+        <w:t>.</w:t>
+      </w:r>
+      <w:proofErr w:type="gramStart"/>
+      <w:r>
+        <w:rPr>
+          <w:sz w:val="24"/>
+          <w:szCs w:val="24"/>
+        </w:rPr>
+        <w:t>label</w:t>
+      </w:r>
+      <w:proofErr w:type="spellEnd"/>
+      <w:r>
+        <w:rPr>
+          <w:sz w:val="24"/>
+          <w:szCs w:val="24"/>
+        </w:rPr>
+        <w:t xml:space="preserve"> }</w:t>
+      </w:r>
+      <w:proofErr w:type="gramEnd"/>
+      <w:r>
+        <w:rPr>
+          <w:sz w:val="24"/>
+          <w:szCs w:val="24"/>
+        </w:rPr>
+        <w:t xml:space="preserve">}: </w:t>
       </w:r>
     </w:p>
     <w:p>
@@ -391,21 +573,50 @@
           <w:szCs w:val="24"/>
         </w:rPr>
       </w:pPr>
-      <w:r>
-        <w:rPr>
-          <w:rFonts w:ascii="Arial" w:hAnsi="Arial" w:cs="Arial"/>
-          <w:sz w:val="24"/>
-          <w:szCs w:val="24"/>
-        </w:rPr>
-        <w:t>{{ field</w:t>
-      </w:r>
-      <w:r>
-        <w:rPr>
-          <w:rFonts w:ascii="Arial" w:hAnsi="Arial" w:cs="Arial"/>
-          <w:sz w:val="24"/>
-          <w:szCs w:val="24"/>
-        </w:rPr>
-        <w:t>.value_if_defined()</w:t>
+      <w:proofErr w:type="gramStart"/>
+      <w:r>
+        <w:rPr>
+          <w:rFonts w:ascii="Arial" w:hAnsi="Arial" w:cs="Arial"/>
+          <w:sz w:val="24"/>
+          <w:szCs w:val="24"/>
+        </w:rPr>
+        <w:t xml:space="preserve">{{ </w:t>
+      </w:r>
+      <w:proofErr w:type="spellStart"/>
+      <w:r>
+        <w:rPr>
+          <w:rFonts w:ascii="Arial" w:hAnsi="Arial" w:cs="Arial"/>
+          <w:sz w:val="24"/>
+          <w:szCs w:val="24"/>
+        </w:rPr>
+        <w:t>field</w:t>
+      </w:r>
+      <w:proofErr w:type="gramEnd"/>
+      <w:r>
+        <w:rPr>
+          <w:rFonts w:ascii="Arial" w:hAnsi="Arial" w:cs="Arial"/>
+          <w:sz w:val="24"/>
+          <w:szCs w:val="24"/>
+        </w:rPr>
+        <w:t>.value_if_</w:t>
+      </w:r>
+      <w:proofErr w:type="gramStart"/>
+      <w:r>
+        <w:rPr>
+          <w:rFonts w:ascii="Arial" w:hAnsi="Arial" w:cs="Arial"/>
+          <w:sz w:val="24"/>
+          <w:szCs w:val="24"/>
+        </w:rPr>
+        <w:t>defined</w:t>
+      </w:r>
+      <w:proofErr w:type="spellEnd"/>
+      <w:r>
+        <w:rPr>
+          <w:rFonts w:ascii="Arial" w:hAnsi="Arial" w:cs="Arial"/>
+          <w:sz w:val="24"/>
+          <w:szCs w:val="24"/>
+        </w:rPr>
+        <w:t>()</w:t>
       </w:r>
       <w:r>
         <w:rPr>
@@ -421,7 +632,16 @@
           <w:sz w:val="24"/>
           <w:szCs w:val="24"/>
         </w:rPr>
-        <w:t xml:space="preserve"> }}</w:t>
+        <w:t xml:space="preserve"> }</w:t>
+      </w:r>
+      <w:proofErr w:type="gramEnd"/>
+      <w:r>
+        <w:rPr>
+          <w:rFonts w:ascii="Arial" w:hAnsi="Arial" w:cs="Arial"/>
+          <w:sz w:val="24"/>
+          <w:szCs w:val="24"/>
+        </w:rPr>
+        <w:t>}</w:t>
       </w:r>
     </w:p>
     <w:p>
@@ -455,7 +675,25 @@
           <w:sz w:val="24"/>
           <w:szCs w:val="24"/>
         </w:rPr>
-        <w:t>{%p endfor %}</w:t>
+        <w:t xml:space="preserve">{%p </w:t>
+      </w:r>
+      <w:proofErr w:type="spellStart"/>
+      <w:r>
+        <w:rPr>
+          <w:rFonts w:ascii="Arial" w:hAnsi="Arial" w:cs="Arial"/>
+          <w:sz w:val="24"/>
+          <w:szCs w:val="24"/>
+        </w:rPr>
+        <w:t>endfor</w:t>
+      </w:r>
+      <w:proofErr w:type="spellEnd"/>
+      <w:r>
+        <w:rPr>
+          <w:rFonts w:ascii="Arial" w:hAnsi="Arial" w:cs="Arial"/>
+          <w:sz w:val="24"/>
+          <w:szCs w:val="24"/>
+        </w:rPr>
+        <w:t xml:space="preserve"> %}</w:t>
       </w:r>
     </w:p>
     <w:p>
@@ -477,7 +715,7 @@
 </file>
 
 <file path=word/styles.xml><?xml version="1.0" encoding="utf-8"?>
-<w:styles xmlns:mc="http://schemas.openxmlformats.org/markup-compatibility/2006" xmlns:r="http://schemas.openxmlformats.org/officeDocument/2006/relationships" xmlns:w="http://schemas.openxmlformats.org/wordprocessingml/2006/main" xmlns:w14="http://schemas.microsoft.com/office/word/2010/wordml" xmlns:w15="http://schemas.microsoft.com/office/word/2012/wordml" xmlns:w16cex="http://schemas.microsoft.com/office/word/2018/wordml/cex" xmlns:w16cid="http://schemas.microsoft.com/office/word/2016/wordml/cid" xmlns:w16="http://schemas.microsoft.com/office/word/2018/wordml" xmlns:w16sdtdh="http://schemas.microsoft.com/office/word/2020/wordml/sdtdatahash" xmlns:w16sdtfl="http://schemas.microsoft.com/office/word/2024/wordml/sdtformatlock" xmlns:w16se="http://schemas.microsoft.com/office/word/2015/wordml/symex" xmlns:w16du="http://schemas.microsoft.com/office/word/2023/wordml/word16du" mc:Ignorable="w14 w15 w16se w16cid w16 w16cex w16sdtdh w16sdtfl w16du">
+<w:styles xmlns:mc="http://schemas.openxmlformats.org/markup-compatibility/2006" xmlns:r="http://schemas.openxmlformats.org/officeDocument/2006/relationships" xmlns:w="http://schemas.openxmlformats.org/wordprocessingml/2006/main" xmlns:w14="http://schemas.microsoft.com/office/word/2010/wordml" xmlns:w15="http://schemas.microsoft.com/office/word/2012/wordml" xmlns:w16cex="http://schemas.microsoft.com/office/word/2018/wordml/cex" xmlns:w16cid="http://schemas.microsoft.com/office/word/2016/wordml/cid" xmlns:w16="http://schemas.microsoft.com/office/word/2018/wordml" xmlns:w16du="http://schemas.microsoft.com/office/word/2023/wordml/word16du" xmlns:w16sdtdh="http://schemas.microsoft.com/office/word/2020/wordml/sdtdatahash" xmlns:w16sdtfl="http://schemas.microsoft.com/office/word/2024/wordml/sdtformatlock" xmlns:w16se="http://schemas.microsoft.com/office/word/2015/wordml/symex" mc:Ignorable="w14 w15 w16se w16cid w16 w16cex w16sdtdh w16sdtfl w16du">
   <w:docDefaults>
     <w:rPrDefault>
       <w:rPr>

</xml_diff>